<commit_message>
Report: follow-up experiments, figure 4 from the demo, David font, page numbers; presentation updates
</commit_message>
<xml_diff>
--- a/docs/Report_Idan_Omri.docx
+++ b/docs/Report_Idan_Omri.docx
@@ -95,7 +95,25 @@
           <w:sz w:val="19"/>
           <w:szCs w:val="19"/>
         </w:rPr>
-        <w:t xml:space="preserve"> / Audio Processing</w:t>
+        <w:t xml:space="preserve"> / </w:t>
+      </w:r>
+      <w:proofErr w:type="spellStart"/>
+      <w:r>
+        <w:rPr>
+          <w:color w:val="5A636A"/>
+          <w:sz w:val="19"/>
+          <w:szCs w:val="19"/>
+        </w:rPr>
+        <w:t>Audio</w:t>
+      </w:r>
+      <w:proofErr w:type="spellEnd"/>
+      <w:r>
+        <w:rPr>
+          <w:color w:val="5A636A"/>
+          <w:sz w:val="19"/>
+          <w:szCs w:val="19"/>
+        </w:rPr>
+        <w:t xml:space="preserve"> Processing</w:t>
       </w:r>
     </w:p>
     <w:p>
@@ -217,9 +235,49 @@
     <w:p>
       <w:pPr>
         <w:jc w:val="both"/>
+        <w:rPr>
+          <w:rtl w:val="0"/>
+        </w:rPr>
       </w:pPr>
       <w:r>
-        <w:t>TSTNN [1] הציע Two-Stage Transformer שעובד ישירות על ה-waveform. האות מחולק למסגרות, ה-Local Transformer רץ בתוך כל מסגרת וה-Global Transformer רץ לאורך המסגרות, וכך מודל של 0.92 מיליון פרמטרים בלבד לומד גם קשרים מקומיים וגם קשרים ארוכי טווח (PESQ 2.96 על VoiceBank-DEMAND). Dynamic Noise Embedding [2] עובד במרחב זמן-תדר, אומד Time-Frequency Mask על ה-magnitude ומשחזר את האות עם iSTFT, ואת שלוש הבחירות האלה לקחנו ממנו. החיבור בין שתי העבודות, ה-Two-Stage Transformer של TSTNN בתוך המסגרת של זמן-תדר, הוא המודל שלנו.</w:t>
+        <w:t xml:space="preserve">TSTNN [1] הציע Two-Stage Transformer שעובד ישירות על ה-waveform. האות מחולק למסגרות, ה-Local Transformer רץ בתוך כל מסגרת וה-Global Transformer רץ לאורך המסגרות, וכך מודל של 0.92 מיליון פרמטרים בלבד לומד גם קשרים מקומיים וגם קשרים ארוכי טווח (PESQ 2.96 על </w:t>
+      </w:r>
+      <w:proofErr w:type="spellStart"/>
+      <w:r>
+        <w:t>VoiceBank</w:t>
+      </w:r>
+      <w:proofErr w:type="spellEnd"/>
+      <w:r>
+        <w:t>-DEMAND).</w:t>
+      </w:r>
+    </w:p>
+    <w:p>
+      <w:pPr>
+        <w:jc w:val="both"/>
+      </w:pPr>
+      <w:proofErr w:type="spellStart"/>
+      <w:r>
+        <w:t>Dynamic</w:t>
+      </w:r>
+      <w:proofErr w:type="spellEnd"/>
+      <w:r>
+        <w:t xml:space="preserve"> </w:t>
+      </w:r>
+      <w:proofErr w:type="spellStart"/>
+      <w:r>
+        <w:t>Noise</w:t>
+      </w:r>
+      <w:proofErr w:type="spellEnd"/>
+      <w:r>
+        <w:t xml:space="preserve"> </w:t>
+      </w:r>
+      <w:proofErr w:type="spellStart"/>
+      <w:r>
+        <w:t>Embedding</w:t>
+      </w:r>
+      <w:proofErr w:type="spellEnd"/>
+      <w:r>
+        <w:t xml:space="preserve"> [2] עובד במרחב זמן-תדר, אומד Time-Frequency Mask על ה-magnitude ומשחזר את האות עם iSTFT, ואת שלוש הבחירות האלה לקחנו ממנו. החיבור בין שתי העבודות, ה-Two-Stage Transformer של TSTNN בתוך המסגרת של זמן-תדר, הוא המודל שלנו.</w:t>
       </w:r>
     </w:p>
     <w:p>
@@ -296,9 +354,8 @@
         <w:rPr>
           <w:noProof/>
         </w:rPr>
-        <w:lastRenderedPageBreak/>
         <w:drawing>
-          <wp:inline distT="0" distB="0" distL="0" distR="0" wp14:anchorId="28712401" wp14:editId="177F0F8F">
+          <wp:inline distT="0" distB="0" distL="0" distR="0" wp14:anchorId="0279EA71" wp14:editId="1A239F22">
             <wp:extent cx="3931920" cy="1817729"/>
             <wp:effectExtent l="0" t="0" r="0" b="0"/>
             <wp:docPr id="1" name="Picture 1"/>
@@ -313,7 +370,7 @@
                     <pic:cNvPicPr/>
                   </pic:nvPicPr>
                   <pic:blipFill>
-                    <a:blip r:embed="rId6"/>
+                    <a:blip r:embed="rId8"/>
                     <a:stretch>
                       <a:fillRect/>
                     </a:stretch>
@@ -354,7 +411,7 @@
           <w:sz w:val="18"/>
           <w:szCs w:val="18"/>
         </w:rPr>
-        <w:t>מבנה המודל. המסלול העליון מכין את הייצוג, הליבה מבצעת Attention לסירוגין על התדר ועל הזמן, והמסלול התחתון מחזיר אות. הפאזה הרועשת לא נכנסת לרשת.</w:t>
+        <w:t>מבנה המודל. המסלול העליון מכין את הייצוג, הליבה עושה Attention לסירוגין על התדר ועל הזמן, והתחתון מחזיר אות.</w:t>
       </w:r>
     </w:p>
     <w:p>
@@ -417,7 +474,11 @@
         </m:r>
       </m:oMath>
       <w:r>
-        <w:t xml:space="preserve">. לדיבור יש טווח דינמי גדול מאוד, ובלי דחיסה הרשת הייתה מתמקדת רק ברכיבים החזקים. בחזקת 0.3 יחס של 1000 בין שני רכיבים הופך ליחס של כ-8, וכך גם הפרטים השקטים שחשובים למובנות מקבלים משקל. </w:t>
+        <w:t xml:space="preserve">. לדיבור יש טווח דינמי גדול מאוד, ובלי דחיסה הרשת הייתה מתמקדת רק ברכיבים החזקים. בחזקת 0.3 יחס של 1000 בין שני </w:t>
+      </w:r>
+      <w:r>
+        <w:lastRenderedPageBreak/>
+        <w:t xml:space="preserve">רכיבים הופך ליחס של כ-8, וכך גם הפרטים השקטים שחשובים למובנות מקבלים משקל. </w:t>
       </w:r>
       <m:oMath>
         <m:r>
@@ -1358,7 +1419,6 @@
           <w:b/>
           <w:color w:val="1F4E79"/>
         </w:rPr>
-        <w:lastRenderedPageBreak/>
         <w:t>המסכה ושחזור האות</w:t>
       </w:r>
     </w:p>
@@ -2641,6 +2701,7 @@
           <w:szCs w:val="22"/>
           <w:rtl w:val="0"/>
         </w:rPr>
+        <w:lastRenderedPageBreak/>
         <w:t>(4)</w:t>
       </w:r>
       <w:r>
@@ -4174,9 +4235,8 @@
         <w:rPr>
           <w:noProof/>
         </w:rPr>
-        <w:lastRenderedPageBreak/>
         <w:drawing>
-          <wp:inline distT="0" distB="0" distL="0" distR="0" wp14:anchorId="0084A896" wp14:editId="7C44287A">
+          <wp:inline distT="0" distB="0" distL="0" distR="0" wp14:anchorId="639CAA07" wp14:editId="0C33B4C0">
             <wp:extent cx="3931920" cy="1105527"/>
             <wp:effectExtent l="0" t="0" r="0" b="0"/>
             <wp:docPr id="2" name="Picture 2"/>
@@ -4191,7 +4251,7 @@
                     <pic:cNvPicPr/>
                   </pic:nvPicPr>
                   <pic:blipFill>
-                    <a:blip r:embed="rId7"/>
+                    <a:blip r:embed="rId9"/>
                     <a:stretch>
                       <a:fillRect/>
                     </a:stretch>
@@ -4232,7 +4292,7 @@
           <w:sz w:val="18"/>
           <w:szCs w:val="18"/>
         </w:rPr>
-        <w:t>(א) PESQ על ה-validation לפי epoch, הכוכב מסמן את ה-epoch שנבחר והקווים המקווקווים את הורדות קצב הלמידה. (ב) ההפסד על סט האימון ועל ה-validation, והחלק של איבר הזמן מתוך ההפסד.</w:t>
+        <w:t>(א) PESQ על ה-validation לפי epoch, הכוכב הוא ה-epoch שנבחר והקווים המקווקווים הורדות של קצב הלמידה. (ב) ההפסד באימון וב-validation, וחלק איבר הזמן.</w:t>
       </w:r>
     </w:p>
     <w:p>
@@ -5592,7 +5652,7 @@
         <w:jc w:val="both"/>
       </w:pPr>
       <w:r>
-        <w:t>המודל הסופי מעלה את PESQ מ-1.97 ל-3.15 ואת SI-SDR בכ-‎10 [dB]‏, ועובר את TSTNN [1] באותו גודל (המספר מהמאמר). מתוך המרחק בין הרועש לתקרה הוא סוגר ב-SI-SDR 89 אחוז, אבל ב-PESQ ובמובנות רק כמחצית (59 ו-44 אחוז). לפער הזה נחזור בדיון. להשוואה הרצנו גם שני מסננים קלאסיים על אותם קבצים, עם הערכת רעש קבועה מהמסגרות השקטות. הם משפרים מעט את PESQ (עד 2.26, קרוב לערך מ-[1]) אבל לא את המובנות, ו-Wiener אף פוגע בה. רעש שמשתנה בזמן לא נתפס בהערכה קבועה, ומה שמוחסר בטעות הוא דיבור.</w:t>
+        <w:t>המודל הסופי מעלה את PESQ מ-1.97 ל-3.15 ואת SI-SDR בכ-‎10 [dB]‏, ועובר את TSTNN [1] באותו גודל (המספר מהמאמר). מתוך המרחק בין הרועש לתקרה הוא סוגר ב-SI-SDR 89 אחוז, אבל ב-PESQ ובמובנות רק כמחצית (59 ו-44 אחוז). לפער הזה נחזור בדיון. להשוואה הרצנו גם שני מסננים קלאסיים על אותם קבצים, עם הערכת רעש קבועה מהמסגרות השקטות. הם משפרים מעט את PESQ (עד 2.26, קרוב לערך מ-[1]) אבל לא את המובנות, ו-Wiener אף פוגע בה. רעש שמשתנה בזמן לא נתפס בהערכה קבועה.</w:t>
       </w:r>
     </w:p>
     <w:p>
@@ -5991,6 +6051,7 @@
         <w:jc w:val="both"/>
       </w:pPr>
       <w:r>
+        <w:lastRenderedPageBreak/>
         <w:t>איור 3א מפרק את התוצאה לפי ה-SNR של הקלט, שאפשר לחשב בדיוק כי הרעש הוא ההפרש בין הרועש לנקי. השיפור ב-PESQ דומה בכל הרמות, אבל השיפור במובנות כמעט כולו ברעש החזק. מתחת ל-‎2.5 [dB]‏ ה-ESTOI עולה ב-0.14, ומעל ‎12.5 [dB]‏ רק ב-0.04. כלומר המודל עוזר הכי הרבה בדיוק איפה שהדיבור הכי קשה להבנה. הוא פוגע ב-PESQ רק ב-4 קבצים מתוך 824, וכולם כמעט נקיים מלכתחילה (SNR של קלט מעל ‎14 [dB]‏).</w:t>
       </w:r>
     </w:p>
@@ -6021,9 +6082,8 @@
         <w:rPr>
           <w:noProof/>
         </w:rPr>
-        <w:lastRenderedPageBreak/>
         <w:drawing>
-          <wp:inline distT="0" distB="0" distL="0" distR="0" wp14:anchorId="5DD1D40B" wp14:editId="55C09BD0">
+          <wp:inline distT="0" distB="0" distL="0" distR="0" wp14:anchorId="36A9D3EF" wp14:editId="2C345BC8">
             <wp:extent cx="3931920" cy="1115127"/>
             <wp:effectExtent l="0" t="0" r="0" b="0"/>
             <wp:docPr id="3" name="Picture 3"/>
@@ -6038,7 +6098,7 @@
                     <pic:cNvPicPr/>
                   </pic:nvPicPr>
                   <pic:blipFill>
-                    <a:blip r:embed="rId8"/>
+                    <a:blip r:embed="rId10"/>
                     <a:stretch>
                       <a:fillRect/>
                     </a:stretch>
@@ -6079,7 +6139,7 @@
           <w:sz w:val="18"/>
           <w:szCs w:val="18"/>
         </w:rPr>
-        <w:t>(א) PESQ על סט הבדיקה לפי ה-SNR של הקלט, לרועש, למודל ולתקרה. (ב) ההתפלגות של ההגבר שהמסכה נותנת ל-magnitude, על כל הנקודות של סט הבדיקה, ל-MSE ול-L1 שאומנו על אותם נתונים.</w:t>
+        <w:t>(א) PESQ על סט הבדיקה לפי ה-SNR של הקלט. (ב) התפלגות ההגבר של המסכה על כל נקודות סט הבדיקה, ל-MSE ול-L1.</w:t>
       </w:r>
     </w:p>
     <w:p>
@@ -6094,8 +6154,8 @@
           <w:noProof/>
         </w:rPr>
         <w:drawing>
-          <wp:inline distT="0" distB="0" distL="0" distR="0" wp14:anchorId="59265107" wp14:editId="2DFF6AE9">
-            <wp:extent cx="3566160" cy="789348"/>
+          <wp:inline distT="0" distB="0" distL="0" distR="0" wp14:anchorId="6FB1C6F8" wp14:editId="122B0498">
+            <wp:extent cx="3566160" cy="910891"/>
             <wp:effectExtent l="0" t="0" r="0" b="0"/>
             <wp:docPr id="4" name="Picture 4"/>
             <wp:cNvGraphicFramePr>
@@ -6109,7 +6169,7 @@
                     <pic:cNvPicPr/>
                   </pic:nvPicPr>
                   <pic:blipFill>
-                    <a:blip r:embed="rId9"/>
+                    <a:blip r:embed="rId11"/>
                     <a:stretch>
                       <a:fillRect/>
                     </a:stretch>
@@ -6117,7 +6177,7 @@
                   <pic:spPr>
                     <a:xfrm>
                       <a:off x="0" y="0"/>
-                      <a:ext cx="3566160" cy="789348"/>
+                      <a:ext cx="3566160" cy="910891"/>
                     </a:xfrm>
                     <a:prstGeom prst="rect">
                       <a:avLst/>
@@ -6150,7 +6210,7 @@
           <w:sz w:val="18"/>
           <w:szCs w:val="18"/>
         </w:rPr>
-        <w:t>דוגמה מסט הבדיקה (p257_202, SNR ‎5.6 [dB]‏). הרשת מסירה את הרעש בין המילים ואת הטון הקבוע באזור ‎7 [kHz]‏, ושומרת על ההרמוניות.</w:t>
+        <w:t>הקלטה שלנו עם רעש של בית קפה ב-‎0 [dB]‏, שהמודל לא שמע באימון. הרעש בין המילים נעלם וההרמוניות נשמרות.</w:t>
       </w:r>
     </w:p>
     <w:p>
@@ -6269,30 +6329,29 @@
       </w:pPr>
       <w:r>
         <w:rPr>
-          <w:u w:val="single"/>
-        </w:rPr>
-        <w:t>ייצוג או פאזה</w:t>
-      </w:r>
-      <w:r>
-        <w:rPr>
           <w:rFonts w:hint="cs"/>
           <w:u w:val="single"/>
         </w:rPr>
-        <w:t>:</w:t>
+        <w:t>הקטנת המודל:</w:t>
       </w:r>
       <w:r>
-        <w:t xml:space="preserve"> TSTNN [1] עובד על ה-waveform כדי לא להזניח את הפאזה, ואנחנו ויתרנו עליה בכוונה. באותו גודל ועם הפאזה הרועשת עברנו אותו ב-PESQ, 3.15 מול 2.96, והיינו מעט מאחוריו רק ב-SSNR, שרגיש לפאזה, 9.65 מול 9.70. כלומר בגודל הזה הייצוג שווה יותר ממה שהפאזה עולה. ה-STFT נותן למודל מראש את הפירוק לתדרים, ש-TSTNN צריך ללמוד מהדגימות, וכך הפרמטרים הולכים למשימה עצמה. לכן לא צריך לוותר על ה-STFT בשביל הפאזה, אלא לתקן אותה רק בנקודות המעורבות, והתקרה מראה שיש עוד מקום עד שהפאזה תהיה החסם. המודל גם קטן ומהיר, 0.88 מיליון פרמטרים, ומעבד דקה של הקלטה בפחות משלוש שניות על </w:t>
+        <w:t xml:space="preserve"> ב-</w:t>
       </w:r>
       <w:proofErr w:type="spellStart"/>
       <w:r>
-        <w:t>Mac</w:t>
+        <w:t>Encoder</w:t>
       </w:r>
       <w:proofErr w:type="spellEnd"/>
       <w:r>
-        <w:rPr>
-          <w:rFonts w:hint="cs"/>
-        </w:rPr>
-        <w:t>.</w:t>
+        <w:t xml:space="preserve"> </w:t>
+      </w:r>
+      <w:proofErr w:type="spellStart"/>
+      <w:r>
+        <w:t>וב-Decoder</w:t>
+      </w:r>
+      <w:proofErr w:type="spellEnd"/>
+      <w:r>
+        <w:t xml:space="preserve"> נמצאים 57 אחוז מהפרמטרים ורוב החישוב, כי הם רצים ברזולוציה המלאה. מספר הפרמטרים בבלוק הצפוף גדל עם K², ולכן 32 ערוצים במקום 64 מקטינים את המודל לכ-0.5 מיליון פרמטרים, ובלי החיבורים הצפופים הבלוק קטן פי 2.5. אפשר גם להפוך את ה-GRU לחד כיווני וסיבתי, שרץ רק קדימה בזמן, וכך לחסוך כמחצית ממנו, כ-15 אחוז מהמודל. השאלה היא כמה איכות הולכת לאיבוד, בעיקר בעיצורים.</w:t>
       </w:r>
     </w:p>
     <w:p>
@@ -6311,6 +6370,9 @@
     <w:p>
       <w:pPr>
         <w:jc w:val="both"/>
+        <w:rPr>
+          <w:rtl w:val="0"/>
+        </w:rPr>
       </w:pPr>
       <w:r>
         <w:t>עמרי, עיבוד אות, ארכיטקטורה ואימון ה-</w:t>
@@ -6378,7 +6440,7 @@
         </w:rPr>
         <w:t xml:space="preserve">[1] </w:t>
       </w:r>
-      <w:hyperlink r:id="rId10">
+      <w:hyperlink r:id="rId12">
         <w:r>
           <w:rPr>
             <w:b/>
@@ -6411,7 +6473,7 @@
         </w:rPr>
         <w:t xml:space="preserve">[2] </w:t>
       </w:r>
-      <w:hyperlink r:id="rId11">
+      <w:hyperlink r:id="rId13">
         <w:r>
           <w:rPr>
             <w:b/>
@@ -6444,7 +6506,7 @@
         </w:rPr>
         <w:t xml:space="preserve">[3] </w:t>
       </w:r>
-      <w:hyperlink r:id="rId12">
+      <w:hyperlink r:id="rId14">
         <w:r>
           <w:rPr>
             <w:b/>
@@ -6465,14 +6527,106 @@
       </w:r>
     </w:p>
     <w:sectPr>
+      <w:footerReference w:type="default" r:id="rId15"/>
       <w:pgSz w:w="12240" w:h="15840"/>
-      <w:pgMar w:top="763" w:right="1022" w:bottom="763" w:left="1022" w:header="720" w:footer="720" w:gutter="0"/>
+      <w:pgMar w:top="763" w:right="1022" w:bottom="763" w:left="1022" w:header="720" w:footer="288" w:gutter="0"/>
       <w:cols w:space="720"/>
       <w:bidi/>
       <w:docGrid w:linePitch="360"/>
     </w:sectPr>
   </w:body>
 </w:document>
+</file>
+
+<file path=word/endnotes.xml><?xml version="1.0" encoding="utf-8"?>
+<w:endnotes xmlns:wpc="http://schemas.microsoft.com/office/word/2010/wordprocessingCanvas" xmlns:cx="http://schemas.microsoft.com/office/drawing/2014/chartex" xmlns:cx1="http://schemas.microsoft.com/office/drawing/2015/9/8/chartex" xmlns:cx2="http://schemas.microsoft.com/office/drawing/2015/10/21/chartex" xmlns:cx3="http://schemas.microsoft.com/office/drawing/2016/5/9/chartex" xmlns:cx4="http://schemas.microsoft.com/office/drawing/2016/5/10/chartex" xmlns:cx5="http://schemas.microsoft.com/office/drawing/2016/5/11/chartex" xmlns:cx6="http://schemas.microsoft.com/office/drawing/2016/5/12/chartex" xmlns:cx7="http://schemas.microsoft.com/office/drawing/2016/5/13/chartex" xmlns:cx8="http://schemas.microsoft.com/office/drawing/2016/5/14/chartex" xmlns:mc="http://schemas.openxmlformats.org/markup-compatibility/2006" xmlns:aink="http://schemas.microsoft.com/office/drawing/2016/ink" xmlns:am3d="http://schemas.microsoft.com/office/drawing/2017/model3d" xmlns:o="urn:schemas-microsoft-com:office:office" xmlns:oel="http://schemas.microsoft.com/office/2019/extlst" xmlns:r="http://schemas.openxmlformats.org/officeDocument/2006/relationships" xmlns:m="http://schemas.openxmlformats.org/officeDocument/2006/math" xmlns:v="urn:schemas-microsoft-com:vml" xmlns:wp14="http://schemas.microsoft.com/office/word/2010/wordprocessingDrawing" xmlns:wp="http://schemas.openxmlformats.org/drawingml/2006/wordprocessingDrawing" xmlns:w10="urn:schemas-microsoft-com:office:word" xmlns:w="http://schemas.openxmlformats.org/wordprocessingml/2006/main" xmlns:w14="http://schemas.microsoft.com/office/word/2010/wordml" xmlns:w15="http://schemas.microsoft.com/office/word/2012/wordml" xmlns:w16cex="http://schemas.microsoft.com/office/word/2018/wordml/cex" xmlns:w16cid="http://schemas.microsoft.com/office/word/2016/wordml/cid" xmlns:w16="http://schemas.microsoft.com/office/word/2018/wordml" xmlns:w16du="http://schemas.microsoft.com/office/word/2023/wordml/word16du" xmlns:w16sdtdh="http://schemas.microsoft.com/office/word/2020/wordml/sdtdatahash" xmlns:w16sdtfl="http://schemas.microsoft.com/office/word/2024/wordml/sdtformatlock" xmlns:w16se="http://schemas.microsoft.com/office/word/2015/wordml/symex" xmlns:wpg="http://schemas.microsoft.com/office/word/2010/wordprocessingGroup" xmlns:wpi="http://schemas.microsoft.com/office/word/2010/wordprocessingInk" xmlns:wne="http://schemas.microsoft.com/office/word/2006/wordml" xmlns:wps="http://schemas.microsoft.com/office/word/2010/wordprocessingShape" mc:Ignorable="w14 w15 w16se w16cid w16 w16cex w16sdtdh w16sdtfl w16du wp14">
+  <w:endnote w:type="separator" w:id="-1">
+    <w:p>
+      <w:pPr>
+        <w:spacing w:after="0"/>
+      </w:pPr>
+      <w:r>
+        <w:separator/>
+      </w:r>
+    </w:p>
+  </w:endnote>
+  <w:endnote w:type="continuationSeparator" w:id="0">
+    <w:p>
+      <w:pPr>
+        <w:spacing w:after="0"/>
+      </w:pPr>
+      <w:r>
+        <w:continuationSeparator/>
+      </w:r>
+    </w:p>
+  </w:endnote>
+</w:endnotes>
+</file>
+
+<file path=word/footer1.xml><?xml version="1.0" encoding="utf-8"?>
+<w:ftr xmlns:wpc="http://schemas.microsoft.com/office/word/2010/wordprocessingCanvas" xmlns:cx="http://schemas.microsoft.com/office/drawing/2014/chartex" xmlns:cx1="http://schemas.microsoft.com/office/drawing/2015/9/8/chartex" xmlns:cx2="http://schemas.microsoft.com/office/drawing/2015/10/21/chartex" xmlns:cx3="http://schemas.microsoft.com/office/drawing/2016/5/9/chartex" xmlns:cx4="http://schemas.microsoft.com/office/drawing/2016/5/10/chartex" xmlns:cx5="http://schemas.microsoft.com/office/drawing/2016/5/11/chartex" xmlns:cx6="http://schemas.microsoft.com/office/drawing/2016/5/12/chartex" xmlns:cx7="http://schemas.microsoft.com/office/drawing/2016/5/13/chartex" xmlns:cx8="http://schemas.microsoft.com/office/drawing/2016/5/14/chartex" xmlns:mc="http://schemas.openxmlformats.org/markup-compatibility/2006" xmlns:aink="http://schemas.microsoft.com/office/drawing/2016/ink" xmlns:am3d="http://schemas.microsoft.com/office/drawing/2017/model3d" xmlns:o="urn:schemas-microsoft-com:office:office" xmlns:oel="http://schemas.microsoft.com/office/2019/extlst" xmlns:r="http://schemas.openxmlformats.org/officeDocument/2006/relationships" xmlns:m="http://schemas.openxmlformats.org/officeDocument/2006/math" xmlns:v="urn:schemas-microsoft-com:vml" xmlns:wp14="http://schemas.microsoft.com/office/word/2010/wordprocessingDrawing" xmlns:wp="http://schemas.openxmlformats.org/drawingml/2006/wordprocessingDrawing" xmlns:w10="urn:schemas-microsoft-com:office:word" xmlns:w="http://schemas.openxmlformats.org/wordprocessingml/2006/main" xmlns:w14="http://schemas.microsoft.com/office/word/2010/wordml" xmlns:w15="http://schemas.microsoft.com/office/word/2012/wordml" xmlns:w16cex="http://schemas.microsoft.com/office/word/2018/wordml/cex" xmlns:w16cid="http://schemas.microsoft.com/office/word/2016/wordml/cid" xmlns:w16="http://schemas.microsoft.com/office/word/2018/wordml" xmlns:w16du="http://schemas.microsoft.com/office/word/2023/wordml/word16du" xmlns:w16sdtdh="http://schemas.microsoft.com/office/word/2020/wordml/sdtdatahash" xmlns:w16sdtfl="http://schemas.microsoft.com/office/word/2024/wordml/sdtformatlock" xmlns:w16se="http://schemas.microsoft.com/office/word/2015/wordml/symex" xmlns:wpg="http://schemas.microsoft.com/office/word/2010/wordprocessingGroup" xmlns:wpi="http://schemas.microsoft.com/office/word/2010/wordprocessingInk" xmlns:wne="http://schemas.microsoft.com/office/word/2006/wordml" xmlns:wps="http://schemas.microsoft.com/office/word/2010/wordprocessingShape" mc:Ignorable="w14 w15 w16se w16cid w16 w16cex w16sdtdh w16sdtfl w16du wp14">
+  <w:p>
+    <w:pPr>
+      <w:pStyle w:val="Footer"/>
+      <w:jc w:val="center"/>
+    </w:pPr>
+    <w:r>
+      <w:rPr>
+        <w:sz w:val="18"/>
+      </w:rPr>
+      <w:fldChar w:fldCharType="begin"/>
+    </w:r>
+    <w:r>
+      <w:rPr>
+        <w:sz w:val="18"/>
+      </w:rPr>
+      <w:instrText xml:space="preserve"> PAGE </w:instrText>
+    </w:r>
+    <w:r>
+      <w:rPr>
+        <w:sz w:val="18"/>
+      </w:rPr>
+      <w:fldChar w:fldCharType="separate"/>
+    </w:r>
+    <w:r>
+      <w:rPr>
+        <w:sz w:val="18"/>
+      </w:rPr>
+      <w:t>1</w:t>
+    </w:r>
+    <w:r>
+      <w:rPr>
+        <w:sz w:val="18"/>
+      </w:rPr>
+      <w:fldChar w:fldCharType="end"/>
+    </w:r>
+  </w:p>
+</w:ftr>
+</file>
+
+<file path=word/footnotes.xml><?xml version="1.0" encoding="utf-8"?>
+<w:footnotes xmlns:wpc="http://schemas.microsoft.com/office/word/2010/wordprocessingCanvas" xmlns:cx="http://schemas.microsoft.com/office/drawing/2014/chartex" xmlns:cx1="http://schemas.microsoft.com/office/drawing/2015/9/8/chartex" xmlns:cx2="http://schemas.microsoft.com/office/drawing/2015/10/21/chartex" xmlns:cx3="http://schemas.microsoft.com/office/drawing/2016/5/9/chartex" xmlns:cx4="http://schemas.microsoft.com/office/drawing/2016/5/10/chartex" xmlns:cx5="http://schemas.microsoft.com/office/drawing/2016/5/11/chartex" xmlns:cx6="http://schemas.microsoft.com/office/drawing/2016/5/12/chartex" xmlns:cx7="http://schemas.microsoft.com/office/drawing/2016/5/13/chartex" xmlns:cx8="http://schemas.microsoft.com/office/drawing/2016/5/14/chartex" xmlns:mc="http://schemas.openxmlformats.org/markup-compatibility/2006" xmlns:aink="http://schemas.microsoft.com/office/drawing/2016/ink" xmlns:am3d="http://schemas.microsoft.com/office/drawing/2017/model3d" xmlns:o="urn:schemas-microsoft-com:office:office" xmlns:oel="http://schemas.microsoft.com/office/2019/extlst" xmlns:r="http://schemas.openxmlformats.org/officeDocument/2006/relationships" xmlns:m="http://schemas.openxmlformats.org/officeDocument/2006/math" xmlns:v="urn:schemas-microsoft-com:vml" xmlns:wp14="http://schemas.microsoft.com/office/word/2010/wordprocessingDrawing" xmlns:wp="http://schemas.openxmlformats.org/drawingml/2006/wordprocessingDrawing" xmlns:w10="urn:schemas-microsoft-com:office:word" xmlns:w="http://schemas.openxmlformats.org/wordprocessingml/2006/main" xmlns:w14="http://schemas.microsoft.com/office/word/2010/wordml" xmlns:w15="http://schemas.microsoft.com/office/word/2012/wordml" xmlns:w16cex="http://schemas.microsoft.com/office/word/2018/wordml/cex" xmlns:w16cid="http://schemas.microsoft.com/office/word/2016/wordml/cid" xmlns:w16="http://schemas.microsoft.com/office/word/2018/wordml" xmlns:w16du="http://schemas.microsoft.com/office/word/2023/wordml/word16du" xmlns:w16sdtdh="http://schemas.microsoft.com/office/word/2020/wordml/sdtdatahash" xmlns:w16sdtfl="http://schemas.microsoft.com/office/word/2024/wordml/sdtformatlock" xmlns:w16se="http://schemas.microsoft.com/office/word/2015/wordml/symex" xmlns:wpg="http://schemas.microsoft.com/office/word/2010/wordprocessingGroup" xmlns:wpi="http://schemas.microsoft.com/office/word/2010/wordprocessingInk" xmlns:wne="http://schemas.microsoft.com/office/word/2006/wordml" xmlns:wps="http://schemas.microsoft.com/office/word/2010/wordprocessingShape" mc:Ignorable="w14 w15 w16se w16cid w16 w16cex w16sdtdh w16sdtfl w16du wp14">
+  <w:footnote w:type="separator" w:id="-1">
+    <w:p>
+      <w:pPr>
+        <w:spacing w:after="0"/>
+      </w:pPr>
+      <w:r>
+        <w:separator/>
+      </w:r>
+    </w:p>
+  </w:footnote>
+  <w:footnote w:type="continuationSeparator" w:id="0">
+    <w:p>
+      <w:pPr>
+        <w:spacing w:after="0"/>
+      </w:pPr>
+      <w:r>
+        <w:continuationSeparator/>
+      </w:r>
+    </w:p>
+  </w:footnote>
+</w:footnotes>
 </file>
 
 <file path=word/numbering.xml><?xml version="1.0" encoding="utf-8"?>
@@ -6683,7 +6837,7 @@
   <w:docDefaults>
     <w:rPrDefault>
       <w:rPr>
-        <w:rFonts w:asciiTheme="minorHAnsi" w:eastAsiaTheme="minorEastAsia" w:hAnsiTheme="minorHAnsi" w:cstheme="minorBidi"/>
+        <w:rFonts w:ascii="David" w:eastAsia="David" w:hAnsi="David" w:cs="David"/>
         <w:sz w:val="21"/>
         <w:szCs w:val="21"/>
         <w:rtl/>
@@ -7073,9 +7227,6 @@
     <w:pPr>
       <w:spacing w:after="60" w:line="240" w:lineRule="auto"/>
     </w:pPr>
-    <w:rPr>
-      <w:rFonts w:ascii="Arial" w:hAnsi="Arial" w:cs="Arial"/>
-    </w:rPr>
   </w:style>
   <w:style w:type="paragraph" w:styleId="Heading1">
     <w:name w:val="heading 1"/>
@@ -7092,7 +7243,6 @@
       <w:outlineLvl w:val="0"/>
     </w:pPr>
     <w:rPr>
-      <w:rFonts w:asciiTheme="majorHAnsi" w:eastAsiaTheme="majorEastAsia" w:hAnsiTheme="majorHAnsi" w:cstheme="majorBidi"/>
       <w:b/>
       <w:bCs/>
       <w:color w:val="1F4E79"/>
@@ -7116,7 +7266,6 @@
       <w:outlineLvl w:val="1"/>
     </w:pPr>
     <w:rPr>
-      <w:rFonts w:asciiTheme="majorHAnsi" w:eastAsiaTheme="majorEastAsia" w:hAnsiTheme="majorHAnsi" w:cstheme="majorBidi"/>
       <w:b/>
       <w:bCs/>
       <w:color w:val="1F4E79"/>
@@ -7140,7 +7289,6 @@
       <w:outlineLvl w:val="2"/>
     </w:pPr>
     <w:rPr>
-      <w:rFonts w:asciiTheme="majorHAnsi" w:eastAsiaTheme="majorEastAsia" w:hAnsiTheme="majorHAnsi" w:cstheme="majorBidi"/>
       <w:b/>
       <w:bCs/>
       <w:color w:val="1F4E79"/>
@@ -7165,7 +7313,6 @@
       <w:outlineLvl w:val="3"/>
     </w:pPr>
     <w:rPr>
-      <w:rFonts w:asciiTheme="majorHAnsi" w:eastAsiaTheme="majorEastAsia" w:hAnsiTheme="majorHAnsi" w:cstheme="majorBidi"/>
       <w:b/>
       <w:bCs/>
       <w:i/>
@@ -7190,7 +7337,6 @@
       <w:outlineLvl w:val="4"/>
     </w:pPr>
     <w:rPr>
-      <w:rFonts w:asciiTheme="majorHAnsi" w:eastAsiaTheme="majorEastAsia" w:hAnsiTheme="majorHAnsi" w:cstheme="majorBidi"/>
       <w:color w:val="243F60" w:themeColor="accent1" w:themeShade="7F"/>
     </w:rPr>
   </w:style>
@@ -7211,7 +7357,6 @@
       <w:outlineLvl w:val="5"/>
     </w:pPr>
     <w:rPr>
-      <w:rFonts w:asciiTheme="majorHAnsi" w:eastAsiaTheme="majorEastAsia" w:hAnsiTheme="majorHAnsi" w:cstheme="majorBidi"/>
       <w:i/>
       <w:iCs/>
       <w:color w:val="243F60" w:themeColor="accent1" w:themeShade="7F"/>
@@ -7234,7 +7379,6 @@
       <w:outlineLvl w:val="6"/>
     </w:pPr>
     <w:rPr>
-      <w:rFonts w:asciiTheme="majorHAnsi" w:eastAsiaTheme="majorEastAsia" w:hAnsiTheme="majorHAnsi" w:cstheme="majorBidi"/>
       <w:i/>
       <w:iCs/>
       <w:color w:val="404040" w:themeColor="text1" w:themeTint="BF"/>
@@ -7257,7 +7401,6 @@
       <w:outlineLvl w:val="7"/>
     </w:pPr>
     <w:rPr>
-      <w:rFonts w:asciiTheme="majorHAnsi" w:eastAsiaTheme="majorEastAsia" w:hAnsiTheme="majorHAnsi" w:cstheme="majorBidi"/>
       <w:color w:val="4F81BD" w:themeColor="accent1"/>
       <w:sz w:val="20"/>
       <w:szCs w:val="20"/>
@@ -7280,7 +7423,6 @@
       <w:outlineLvl w:val="8"/>
     </w:pPr>
     <w:rPr>
-      <w:rFonts w:asciiTheme="majorHAnsi" w:eastAsiaTheme="majorEastAsia" w:hAnsiTheme="majorHAnsi" w:cstheme="majorBidi"/>
       <w:i/>
       <w:iCs/>
       <w:color w:val="404040" w:themeColor="text1" w:themeTint="BF"/>
@@ -7375,7 +7517,7 @@
     <w:uiPriority w:val="9"/>
     <w:rsid w:val="00FC693F"/>
     <w:rPr>
-      <w:rFonts w:asciiTheme="majorHAnsi" w:eastAsiaTheme="majorEastAsia" w:hAnsiTheme="majorHAnsi" w:cstheme="majorBidi"/>
+      <w:rFonts w:ascii="David" w:eastAsia="David" w:hAnsi="David" w:cs="David"/>
       <w:b/>
       <w:bCs/>
       <w:color w:val="365F91" w:themeColor="accent1" w:themeShade="BF"/>
@@ -7390,7 +7532,7 @@
     <w:uiPriority w:val="9"/>
     <w:rsid w:val="00FC693F"/>
     <w:rPr>
-      <w:rFonts w:asciiTheme="majorHAnsi" w:eastAsiaTheme="majorEastAsia" w:hAnsiTheme="majorHAnsi" w:cstheme="majorBidi"/>
+      <w:rFonts w:ascii="David" w:eastAsia="David" w:hAnsi="David" w:cs="David"/>
       <w:b/>
       <w:bCs/>
       <w:color w:val="4F81BD" w:themeColor="accent1"/>
@@ -7405,7 +7547,7 @@
     <w:uiPriority w:val="9"/>
     <w:rsid w:val="00FC693F"/>
     <w:rPr>
-      <w:rFonts w:asciiTheme="majorHAnsi" w:eastAsiaTheme="majorEastAsia" w:hAnsiTheme="majorHAnsi" w:cstheme="majorBidi"/>
+      <w:rFonts w:ascii="David" w:eastAsia="David" w:hAnsi="David" w:cs="David"/>
       <w:b/>
       <w:bCs/>
       <w:color w:val="4F81BD" w:themeColor="accent1"/>
@@ -7427,7 +7569,6 @@
       <w:contextualSpacing/>
     </w:pPr>
     <w:rPr>
-      <w:rFonts w:asciiTheme="majorHAnsi" w:eastAsiaTheme="majorEastAsia" w:hAnsiTheme="majorHAnsi" w:cstheme="majorBidi"/>
       <w:color w:val="17365D" w:themeColor="text2" w:themeShade="BF"/>
       <w:spacing w:val="5"/>
       <w:kern w:val="28"/>
@@ -7442,7 +7583,7 @@
     <w:uiPriority w:val="10"/>
     <w:rsid w:val="00FC693F"/>
     <w:rPr>
-      <w:rFonts w:asciiTheme="majorHAnsi" w:eastAsiaTheme="majorEastAsia" w:hAnsiTheme="majorHAnsi" w:cstheme="majorBidi"/>
+      <w:rFonts w:ascii="David" w:eastAsia="David" w:hAnsi="David" w:cs="David"/>
       <w:color w:val="17365D" w:themeColor="text2" w:themeShade="BF"/>
       <w:spacing w:val="5"/>
       <w:kern w:val="28"/>
@@ -7464,7 +7605,6 @@
       </w:numPr>
     </w:pPr>
     <w:rPr>
-      <w:rFonts w:asciiTheme="majorHAnsi" w:eastAsiaTheme="majorEastAsia" w:hAnsiTheme="majorHAnsi" w:cstheme="majorBidi"/>
       <w:i/>
       <w:iCs/>
       <w:color w:val="4F81BD" w:themeColor="accent1"/>
@@ -7480,7 +7620,7 @@
     <w:uiPriority w:val="11"/>
     <w:rsid w:val="00FC693F"/>
     <w:rPr>
-      <w:rFonts w:asciiTheme="majorHAnsi" w:eastAsiaTheme="majorEastAsia" w:hAnsiTheme="majorHAnsi" w:cstheme="majorBidi"/>
+      <w:rFonts w:ascii="David" w:eastAsia="David" w:hAnsi="David" w:cs="David"/>
       <w:i/>
       <w:iCs/>
       <w:color w:val="4F81BD" w:themeColor="accent1"/>
@@ -7727,7 +7867,6 @@
       </w:tabs>
     </w:pPr>
     <w:rPr>
-      <w:rFonts w:ascii="Courier" w:hAnsi="Courier"/>
       <w:sz w:val="20"/>
       <w:szCs w:val="20"/>
     </w:rPr>
@@ -7739,7 +7878,7 @@
     <w:uiPriority w:val="99"/>
     <w:rsid w:val="0029639D"/>
     <w:rPr>
-      <w:rFonts w:ascii="Courier" w:hAnsi="Courier"/>
+      <w:rFonts w:ascii="David" w:eastAsia="David" w:hAnsi="David" w:cs="David"/>
       <w:sz w:val="20"/>
       <w:szCs w:val="20"/>
     </w:rPr>
@@ -7778,7 +7917,7 @@
     <w:semiHidden/>
     <w:rsid w:val="00FC693F"/>
     <w:rPr>
-      <w:rFonts w:asciiTheme="majorHAnsi" w:eastAsiaTheme="majorEastAsia" w:hAnsiTheme="majorHAnsi" w:cstheme="majorBidi"/>
+      <w:rFonts w:ascii="David" w:eastAsia="David" w:hAnsi="David" w:cs="David"/>
       <w:b/>
       <w:bCs/>
       <w:i/>
@@ -7794,7 +7933,7 @@
     <w:semiHidden/>
     <w:rsid w:val="00FC693F"/>
     <w:rPr>
-      <w:rFonts w:asciiTheme="majorHAnsi" w:eastAsiaTheme="majorEastAsia" w:hAnsiTheme="majorHAnsi" w:cstheme="majorBidi"/>
+      <w:rFonts w:ascii="David" w:eastAsia="David" w:hAnsi="David" w:cs="David"/>
       <w:color w:val="243F60" w:themeColor="accent1" w:themeShade="7F"/>
     </w:rPr>
   </w:style>
@@ -7806,7 +7945,7 @@
     <w:semiHidden/>
     <w:rsid w:val="00FC693F"/>
     <w:rPr>
-      <w:rFonts w:asciiTheme="majorHAnsi" w:eastAsiaTheme="majorEastAsia" w:hAnsiTheme="majorHAnsi" w:cstheme="majorBidi"/>
+      <w:rFonts w:ascii="David" w:eastAsia="David" w:hAnsi="David" w:cs="David"/>
       <w:i/>
       <w:iCs/>
       <w:color w:val="243F60" w:themeColor="accent1" w:themeShade="7F"/>
@@ -7820,7 +7959,7 @@
     <w:semiHidden/>
     <w:rsid w:val="00FC693F"/>
     <w:rPr>
-      <w:rFonts w:asciiTheme="majorHAnsi" w:eastAsiaTheme="majorEastAsia" w:hAnsiTheme="majorHAnsi" w:cstheme="majorBidi"/>
+      <w:rFonts w:ascii="David" w:eastAsia="David" w:hAnsi="David" w:cs="David"/>
       <w:i/>
       <w:iCs/>
       <w:color w:val="404040" w:themeColor="text1" w:themeTint="BF"/>
@@ -7834,7 +7973,7 @@
     <w:semiHidden/>
     <w:rsid w:val="00FC693F"/>
     <w:rPr>
-      <w:rFonts w:asciiTheme="majorHAnsi" w:eastAsiaTheme="majorEastAsia" w:hAnsiTheme="majorHAnsi" w:cstheme="majorBidi"/>
+      <w:rFonts w:ascii="David" w:eastAsia="David" w:hAnsi="David" w:cs="David"/>
       <w:color w:val="4F81BD" w:themeColor="accent1"/>
       <w:sz w:val="20"/>
       <w:szCs w:val="20"/>
@@ -7848,7 +7987,7 @@
     <w:semiHidden/>
     <w:rsid w:val="00FC693F"/>
     <w:rPr>
-      <w:rFonts w:asciiTheme="majorHAnsi" w:eastAsiaTheme="majorEastAsia" w:hAnsiTheme="majorHAnsi" w:cstheme="majorBidi"/>
+      <w:rFonts w:ascii="David" w:eastAsia="David" w:hAnsi="David" w:cs="David"/>
       <w:i/>
       <w:iCs/>
       <w:color w:val="404040" w:themeColor="text1" w:themeTint="BF"/>
@@ -9322,7 +9461,7 @@
         <w:spacing w:before="0" w:after="0" w:line="240" w:lineRule="auto"/>
       </w:pPr>
       <w:rPr>
-        <w:rFonts w:asciiTheme="majorHAnsi" w:eastAsiaTheme="majorEastAsia" w:hAnsiTheme="majorHAnsi" w:cstheme="majorBidi"/>
+        <w:rFonts w:ascii="David" w:eastAsia="David" w:hAnsi="David" w:cs="David"/>
         <w:b/>
         <w:bCs/>
       </w:rPr>
@@ -9343,7 +9482,7 @@
         <w:spacing w:before="0" w:after="0" w:line="240" w:lineRule="auto"/>
       </w:pPr>
       <w:rPr>
-        <w:rFonts w:asciiTheme="majorHAnsi" w:eastAsiaTheme="majorEastAsia" w:hAnsiTheme="majorHAnsi" w:cstheme="majorBidi"/>
+        <w:rFonts w:ascii="David" w:eastAsia="David" w:hAnsi="David" w:cs="David"/>
         <w:b/>
         <w:bCs/>
       </w:rPr>
@@ -9361,14 +9500,14 @@
     </w:tblStylePr>
     <w:tblStylePr w:type="firstCol">
       <w:rPr>
-        <w:rFonts w:asciiTheme="majorHAnsi" w:eastAsiaTheme="majorEastAsia" w:hAnsiTheme="majorHAnsi" w:cstheme="majorBidi"/>
+        <w:rFonts w:ascii="David" w:eastAsia="David" w:hAnsi="David" w:cs="David"/>
         <w:b/>
         <w:bCs/>
       </w:rPr>
     </w:tblStylePr>
     <w:tblStylePr w:type="lastCol">
       <w:rPr>
-        <w:rFonts w:asciiTheme="majorHAnsi" w:eastAsiaTheme="majorEastAsia" w:hAnsiTheme="majorHAnsi" w:cstheme="majorBidi"/>
+        <w:rFonts w:ascii="David" w:eastAsia="David" w:hAnsi="David" w:cs="David"/>
         <w:b/>
         <w:bCs/>
       </w:rPr>
@@ -9445,7 +9584,7 @@
         <w:spacing w:before="0" w:after="0" w:line="240" w:lineRule="auto"/>
       </w:pPr>
       <w:rPr>
-        <w:rFonts w:asciiTheme="majorHAnsi" w:eastAsiaTheme="majorEastAsia" w:hAnsiTheme="majorHAnsi" w:cstheme="majorBidi"/>
+        <w:rFonts w:ascii="David" w:eastAsia="David" w:hAnsi="David" w:cs="David"/>
         <w:b/>
         <w:bCs/>
       </w:rPr>
@@ -9466,7 +9605,7 @@
         <w:spacing w:before="0" w:after="0" w:line="240" w:lineRule="auto"/>
       </w:pPr>
       <w:rPr>
-        <w:rFonts w:asciiTheme="majorHAnsi" w:eastAsiaTheme="majorEastAsia" w:hAnsiTheme="majorHAnsi" w:cstheme="majorBidi"/>
+        <w:rFonts w:ascii="David" w:eastAsia="David" w:hAnsi="David" w:cs="David"/>
         <w:b/>
         <w:bCs/>
       </w:rPr>
@@ -9484,14 +9623,14 @@
     </w:tblStylePr>
     <w:tblStylePr w:type="firstCol">
       <w:rPr>
-        <w:rFonts w:asciiTheme="majorHAnsi" w:eastAsiaTheme="majorEastAsia" w:hAnsiTheme="majorHAnsi" w:cstheme="majorBidi"/>
+        <w:rFonts w:ascii="David" w:eastAsia="David" w:hAnsi="David" w:cs="David"/>
         <w:b/>
         <w:bCs/>
       </w:rPr>
     </w:tblStylePr>
     <w:tblStylePr w:type="lastCol">
       <w:rPr>
-        <w:rFonts w:asciiTheme="majorHAnsi" w:eastAsiaTheme="majorEastAsia" w:hAnsiTheme="majorHAnsi" w:cstheme="majorBidi"/>
+        <w:rFonts w:ascii="David" w:eastAsia="David" w:hAnsi="David" w:cs="David"/>
         <w:b/>
         <w:bCs/>
       </w:rPr>
@@ -9568,7 +9707,7 @@
         <w:spacing w:before="0" w:after="0" w:line="240" w:lineRule="auto"/>
       </w:pPr>
       <w:rPr>
-        <w:rFonts w:asciiTheme="majorHAnsi" w:eastAsiaTheme="majorEastAsia" w:hAnsiTheme="majorHAnsi" w:cstheme="majorBidi"/>
+        <w:rFonts w:ascii="David" w:eastAsia="David" w:hAnsi="David" w:cs="David"/>
         <w:b/>
         <w:bCs/>
       </w:rPr>
@@ -9589,7 +9728,7 @@
         <w:spacing w:before="0" w:after="0" w:line="240" w:lineRule="auto"/>
       </w:pPr>
       <w:rPr>
-        <w:rFonts w:asciiTheme="majorHAnsi" w:eastAsiaTheme="majorEastAsia" w:hAnsiTheme="majorHAnsi" w:cstheme="majorBidi"/>
+        <w:rFonts w:ascii="David" w:eastAsia="David" w:hAnsi="David" w:cs="David"/>
         <w:b/>
         <w:bCs/>
       </w:rPr>
@@ -9607,14 +9746,14 @@
     </w:tblStylePr>
     <w:tblStylePr w:type="firstCol">
       <w:rPr>
-        <w:rFonts w:asciiTheme="majorHAnsi" w:eastAsiaTheme="majorEastAsia" w:hAnsiTheme="majorHAnsi" w:cstheme="majorBidi"/>
+        <w:rFonts w:ascii="David" w:eastAsia="David" w:hAnsi="David" w:cs="David"/>
         <w:b/>
         <w:bCs/>
       </w:rPr>
     </w:tblStylePr>
     <w:tblStylePr w:type="lastCol">
       <w:rPr>
-        <w:rFonts w:asciiTheme="majorHAnsi" w:eastAsiaTheme="majorEastAsia" w:hAnsiTheme="majorHAnsi" w:cstheme="majorBidi"/>
+        <w:rFonts w:ascii="David" w:eastAsia="David" w:hAnsi="David" w:cs="David"/>
         <w:b/>
         <w:bCs/>
       </w:rPr>
@@ -9691,7 +9830,7 @@
         <w:spacing w:before="0" w:after="0" w:line="240" w:lineRule="auto"/>
       </w:pPr>
       <w:rPr>
-        <w:rFonts w:asciiTheme="majorHAnsi" w:eastAsiaTheme="majorEastAsia" w:hAnsiTheme="majorHAnsi" w:cstheme="majorBidi"/>
+        <w:rFonts w:ascii="David" w:eastAsia="David" w:hAnsi="David" w:cs="David"/>
         <w:b/>
         <w:bCs/>
       </w:rPr>
@@ -9712,7 +9851,7 @@
         <w:spacing w:before="0" w:after="0" w:line="240" w:lineRule="auto"/>
       </w:pPr>
       <w:rPr>
-        <w:rFonts w:asciiTheme="majorHAnsi" w:eastAsiaTheme="majorEastAsia" w:hAnsiTheme="majorHAnsi" w:cstheme="majorBidi"/>
+        <w:rFonts w:ascii="David" w:eastAsia="David" w:hAnsi="David" w:cs="David"/>
         <w:b/>
         <w:bCs/>
       </w:rPr>
@@ -9730,14 +9869,14 @@
     </w:tblStylePr>
     <w:tblStylePr w:type="firstCol">
       <w:rPr>
-        <w:rFonts w:asciiTheme="majorHAnsi" w:eastAsiaTheme="majorEastAsia" w:hAnsiTheme="majorHAnsi" w:cstheme="majorBidi"/>
+        <w:rFonts w:ascii="David" w:eastAsia="David" w:hAnsi="David" w:cs="David"/>
         <w:b/>
         <w:bCs/>
       </w:rPr>
     </w:tblStylePr>
     <w:tblStylePr w:type="lastCol">
       <w:rPr>
-        <w:rFonts w:asciiTheme="majorHAnsi" w:eastAsiaTheme="majorEastAsia" w:hAnsiTheme="majorHAnsi" w:cstheme="majorBidi"/>
+        <w:rFonts w:ascii="David" w:eastAsia="David" w:hAnsi="David" w:cs="David"/>
         <w:b/>
         <w:bCs/>
       </w:rPr>
@@ -9814,7 +9953,7 @@
         <w:spacing w:before="0" w:after="0" w:line="240" w:lineRule="auto"/>
       </w:pPr>
       <w:rPr>
-        <w:rFonts w:asciiTheme="majorHAnsi" w:eastAsiaTheme="majorEastAsia" w:hAnsiTheme="majorHAnsi" w:cstheme="majorBidi"/>
+        <w:rFonts w:ascii="David" w:eastAsia="David" w:hAnsi="David" w:cs="David"/>
         <w:b/>
         <w:bCs/>
       </w:rPr>
@@ -9835,7 +9974,7 @@
         <w:spacing w:before="0" w:after="0" w:line="240" w:lineRule="auto"/>
       </w:pPr>
       <w:rPr>
-        <w:rFonts w:asciiTheme="majorHAnsi" w:eastAsiaTheme="majorEastAsia" w:hAnsiTheme="majorHAnsi" w:cstheme="majorBidi"/>
+        <w:rFonts w:ascii="David" w:eastAsia="David" w:hAnsi="David" w:cs="David"/>
         <w:b/>
         <w:bCs/>
       </w:rPr>
@@ -9853,14 +9992,14 @@
     </w:tblStylePr>
     <w:tblStylePr w:type="firstCol">
       <w:rPr>
-        <w:rFonts w:asciiTheme="majorHAnsi" w:eastAsiaTheme="majorEastAsia" w:hAnsiTheme="majorHAnsi" w:cstheme="majorBidi"/>
+        <w:rFonts w:ascii="David" w:eastAsia="David" w:hAnsi="David" w:cs="David"/>
         <w:b/>
         <w:bCs/>
       </w:rPr>
     </w:tblStylePr>
     <w:tblStylePr w:type="lastCol">
       <w:rPr>
-        <w:rFonts w:asciiTheme="majorHAnsi" w:eastAsiaTheme="majorEastAsia" w:hAnsiTheme="majorHAnsi" w:cstheme="majorBidi"/>
+        <w:rFonts w:ascii="David" w:eastAsia="David" w:hAnsi="David" w:cs="David"/>
         <w:b/>
         <w:bCs/>
       </w:rPr>
@@ -9937,7 +10076,7 @@
         <w:spacing w:before="0" w:after="0" w:line="240" w:lineRule="auto"/>
       </w:pPr>
       <w:rPr>
-        <w:rFonts w:asciiTheme="majorHAnsi" w:eastAsiaTheme="majorEastAsia" w:hAnsiTheme="majorHAnsi" w:cstheme="majorBidi"/>
+        <w:rFonts w:ascii="David" w:eastAsia="David" w:hAnsi="David" w:cs="David"/>
         <w:b/>
         <w:bCs/>
       </w:rPr>
@@ -9958,7 +10097,7 @@
         <w:spacing w:before="0" w:after="0" w:line="240" w:lineRule="auto"/>
       </w:pPr>
       <w:rPr>
-        <w:rFonts w:asciiTheme="majorHAnsi" w:eastAsiaTheme="majorEastAsia" w:hAnsiTheme="majorHAnsi" w:cstheme="majorBidi"/>
+        <w:rFonts w:ascii="David" w:eastAsia="David" w:hAnsi="David" w:cs="David"/>
         <w:b/>
         <w:bCs/>
       </w:rPr>
@@ -9976,14 +10115,14 @@
     </w:tblStylePr>
     <w:tblStylePr w:type="firstCol">
       <w:rPr>
-        <w:rFonts w:asciiTheme="majorHAnsi" w:eastAsiaTheme="majorEastAsia" w:hAnsiTheme="majorHAnsi" w:cstheme="majorBidi"/>
+        <w:rFonts w:ascii="David" w:eastAsia="David" w:hAnsi="David" w:cs="David"/>
         <w:b/>
         <w:bCs/>
       </w:rPr>
     </w:tblStylePr>
     <w:tblStylePr w:type="lastCol">
       <w:rPr>
-        <w:rFonts w:asciiTheme="majorHAnsi" w:eastAsiaTheme="majorEastAsia" w:hAnsiTheme="majorHAnsi" w:cstheme="majorBidi"/>
+        <w:rFonts w:ascii="David" w:eastAsia="David" w:hAnsi="David" w:cs="David"/>
         <w:b/>
         <w:bCs/>
       </w:rPr>
@@ -10060,7 +10199,7 @@
         <w:spacing w:before="0" w:after="0" w:line="240" w:lineRule="auto"/>
       </w:pPr>
       <w:rPr>
-        <w:rFonts w:asciiTheme="majorHAnsi" w:eastAsiaTheme="majorEastAsia" w:hAnsiTheme="majorHAnsi" w:cstheme="majorBidi"/>
+        <w:rFonts w:ascii="David" w:eastAsia="David" w:hAnsi="David" w:cs="David"/>
         <w:b/>
         <w:bCs/>
       </w:rPr>
@@ -10081,7 +10220,7 @@
         <w:spacing w:before="0" w:after="0" w:line="240" w:lineRule="auto"/>
       </w:pPr>
       <w:rPr>
-        <w:rFonts w:asciiTheme="majorHAnsi" w:eastAsiaTheme="majorEastAsia" w:hAnsiTheme="majorHAnsi" w:cstheme="majorBidi"/>
+        <w:rFonts w:ascii="David" w:eastAsia="David" w:hAnsi="David" w:cs="David"/>
         <w:b/>
         <w:bCs/>
       </w:rPr>
@@ -10099,14 +10238,14 @@
     </w:tblStylePr>
     <w:tblStylePr w:type="firstCol">
       <w:rPr>
-        <w:rFonts w:asciiTheme="majorHAnsi" w:eastAsiaTheme="majorEastAsia" w:hAnsiTheme="majorHAnsi" w:cstheme="majorBidi"/>
+        <w:rFonts w:ascii="David" w:eastAsia="David" w:hAnsi="David" w:cs="David"/>
         <w:b/>
         <w:bCs/>
       </w:rPr>
     </w:tblStylePr>
     <w:tblStylePr w:type="lastCol">
       <w:rPr>
-        <w:rFonts w:asciiTheme="majorHAnsi" w:eastAsiaTheme="majorEastAsia" w:hAnsiTheme="majorHAnsi" w:cstheme="majorBidi"/>
+        <w:rFonts w:ascii="David" w:eastAsia="David" w:hAnsi="David" w:cs="David"/>
         <w:b/>
         <w:bCs/>
       </w:rPr>
@@ -11866,7 +12005,7 @@
     </w:tblPr>
     <w:tblStylePr w:type="firstRow">
       <w:rPr>
-        <w:rFonts w:asciiTheme="majorHAnsi" w:eastAsiaTheme="majorEastAsia" w:hAnsiTheme="majorHAnsi" w:cstheme="majorBidi"/>
+        <w:rFonts w:ascii="David" w:eastAsia="David" w:hAnsi="David" w:cs="David"/>
       </w:rPr>
       <w:tblPr/>
       <w:tcPr>
@@ -11943,7 +12082,7 @@
     </w:tblPr>
     <w:tblStylePr w:type="firstRow">
       <w:rPr>
-        <w:rFonts w:asciiTheme="majorHAnsi" w:eastAsiaTheme="majorEastAsia" w:hAnsiTheme="majorHAnsi" w:cstheme="majorBidi"/>
+        <w:rFonts w:ascii="David" w:eastAsia="David" w:hAnsi="David" w:cs="David"/>
       </w:rPr>
       <w:tblPr/>
       <w:tcPr>
@@ -12020,7 +12159,7 @@
     </w:tblPr>
     <w:tblStylePr w:type="firstRow">
       <w:rPr>
-        <w:rFonts w:asciiTheme="majorHAnsi" w:eastAsiaTheme="majorEastAsia" w:hAnsiTheme="majorHAnsi" w:cstheme="majorBidi"/>
+        <w:rFonts w:ascii="David" w:eastAsia="David" w:hAnsi="David" w:cs="David"/>
       </w:rPr>
       <w:tblPr/>
       <w:tcPr>
@@ -12097,7 +12236,7 @@
     </w:tblPr>
     <w:tblStylePr w:type="firstRow">
       <w:rPr>
-        <w:rFonts w:asciiTheme="majorHAnsi" w:eastAsiaTheme="majorEastAsia" w:hAnsiTheme="majorHAnsi" w:cstheme="majorBidi"/>
+        <w:rFonts w:ascii="David" w:eastAsia="David" w:hAnsi="David" w:cs="David"/>
       </w:rPr>
       <w:tblPr/>
       <w:tcPr>
@@ -12174,7 +12313,7 @@
     </w:tblPr>
     <w:tblStylePr w:type="firstRow">
       <w:rPr>
-        <w:rFonts w:asciiTheme="majorHAnsi" w:eastAsiaTheme="majorEastAsia" w:hAnsiTheme="majorHAnsi" w:cstheme="majorBidi"/>
+        <w:rFonts w:ascii="David" w:eastAsia="David" w:hAnsi="David" w:cs="David"/>
       </w:rPr>
       <w:tblPr/>
       <w:tcPr>
@@ -12251,7 +12390,7 @@
     </w:tblPr>
     <w:tblStylePr w:type="firstRow">
       <w:rPr>
-        <w:rFonts w:asciiTheme="majorHAnsi" w:eastAsiaTheme="majorEastAsia" w:hAnsiTheme="majorHAnsi" w:cstheme="majorBidi"/>
+        <w:rFonts w:ascii="David" w:eastAsia="David" w:hAnsi="David" w:cs="David"/>
       </w:rPr>
       <w:tblPr/>
       <w:tcPr>
@@ -12328,7 +12467,7 @@
     </w:tblPr>
     <w:tblStylePr w:type="firstRow">
       <w:rPr>
-        <w:rFonts w:asciiTheme="majorHAnsi" w:eastAsiaTheme="majorEastAsia" w:hAnsiTheme="majorHAnsi" w:cstheme="majorBidi"/>
+        <w:rFonts w:ascii="David" w:eastAsia="David" w:hAnsi="David" w:cs="David"/>
       </w:rPr>
       <w:tblPr/>
       <w:tcPr>
@@ -12393,7 +12532,6 @@
       <w:spacing w:after="0" w:line="240" w:lineRule="auto"/>
     </w:pPr>
     <w:rPr>
-      <w:rFonts w:asciiTheme="majorHAnsi" w:eastAsiaTheme="majorEastAsia" w:hAnsiTheme="majorHAnsi" w:cstheme="majorBidi"/>
       <w:color w:val="000000" w:themeColor="text1"/>
     </w:rPr>
     <w:tblPr>
@@ -12514,7 +12652,6 @@
       <w:spacing w:after="0" w:line="240" w:lineRule="auto"/>
     </w:pPr>
     <w:rPr>
-      <w:rFonts w:asciiTheme="majorHAnsi" w:eastAsiaTheme="majorEastAsia" w:hAnsiTheme="majorHAnsi" w:cstheme="majorBidi"/>
       <w:color w:val="000000" w:themeColor="text1"/>
     </w:rPr>
     <w:tblPr>
@@ -12635,7 +12772,6 @@
       <w:spacing w:after="0" w:line="240" w:lineRule="auto"/>
     </w:pPr>
     <w:rPr>
-      <w:rFonts w:asciiTheme="majorHAnsi" w:eastAsiaTheme="majorEastAsia" w:hAnsiTheme="majorHAnsi" w:cstheme="majorBidi"/>
       <w:color w:val="000000" w:themeColor="text1"/>
     </w:rPr>
     <w:tblPr>
@@ -12756,7 +12892,6 @@
       <w:spacing w:after="0" w:line="240" w:lineRule="auto"/>
     </w:pPr>
     <w:rPr>
-      <w:rFonts w:asciiTheme="majorHAnsi" w:eastAsiaTheme="majorEastAsia" w:hAnsiTheme="majorHAnsi" w:cstheme="majorBidi"/>
       <w:color w:val="000000" w:themeColor="text1"/>
     </w:rPr>
     <w:tblPr>
@@ -12877,7 +13012,6 @@
       <w:spacing w:after="0" w:line="240" w:lineRule="auto"/>
     </w:pPr>
     <w:rPr>
-      <w:rFonts w:asciiTheme="majorHAnsi" w:eastAsiaTheme="majorEastAsia" w:hAnsiTheme="majorHAnsi" w:cstheme="majorBidi"/>
       <w:color w:val="000000" w:themeColor="text1"/>
     </w:rPr>
     <w:tblPr>
@@ -12998,7 +13132,6 @@
       <w:spacing w:after="0" w:line="240" w:lineRule="auto"/>
     </w:pPr>
     <w:rPr>
-      <w:rFonts w:asciiTheme="majorHAnsi" w:eastAsiaTheme="majorEastAsia" w:hAnsiTheme="majorHAnsi" w:cstheme="majorBidi"/>
       <w:color w:val="000000" w:themeColor="text1"/>
     </w:rPr>
     <w:tblPr>
@@ -13119,7 +13252,6 @@
       <w:spacing w:after="0" w:line="240" w:lineRule="auto"/>
     </w:pPr>
     <w:rPr>
-      <w:rFonts w:asciiTheme="majorHAnsi" w:eastAsiaTheme="majorEastAsia" w:hAnsiTheme="majorHAnsi" w:cstheme="majorBidi"/>
       <w:color w:val="000000" w:themeColor="text1"/>
     </w:rPr>
     <w:tblPr>
@@ -13702,7 +13834,6 @@
       <w:spacing w:after="0" w:line="240" w:lineRule="auto"/>
     </w:pPr>
     <w:rPr>
-      <w:rFonts w:asciiTheme="majorHAnsi" w:eastAsiaTheme="majorEastAsia" w:hAnsiTheme="majorHAnsi" w:cstheme="majorBidi"/>
       <w:color w:val="000000" w:themeColor="text1"/>
     </w:rPr>
     <w:tblPr>
@@ -13820,7 +13951,6 @@
       <w:spacing w:after="0" w:line="240" w:lineRule="auto"/>
     </w:pPr>
     <w:rPr>
-      <w:rFonts w:asciiTheme="majorHAnsi" w:eastAsiaTheme="majorEastAsia" w:hAnsiTheme="majorHAnsi" w:cstheme="majorBidi"/>
       <w:color w:val="000000" w:themeColor="text1"/>
     </w:rPr>
     <w:tblPr>
@@ -13938,7 +14068,6 @@
       <w:spacing w:after="0" w:line="240" w:lineRule="auto"/>
     </w:pPr>
     <w:rPr>
-      <w:rFonts w:asciiTheme="majorHAnsi" w:eastAsiaTheme="majorEastAsia" w:hAnsiTheme="majorHAnsi" w:cstheme="majorBidi"/>
       <w:color w:val="000000" w:themeColor="text1"/>
     </w:rPr>
     <w:tblPr>
@@ -14056,7 +14185,6 @@
       <w:spacing w:after="0" w:line="240" w:lineRule="auto"/>
     </w:pPr>
     <w:rPr>
-      <w:rFonts w:asciiTheme="majorHAnsi" w:eastAsiaTheme="majorEastAsia" w:hAnsiTheme="majorHAnsi" w:cstheme="majorBidi"/>
       <w:color w:val="000000" w:themeColor="text1"/>
     </w:rPr>
     <w:tblPr>
@@ -14174,7 +14302,6 @@
       <w:spacing w:after="0" w:line="240" w:lineRule="auto"/>
     </w:pPr>
     <w:rPr>
-      <w:rFonts w:asciiTheme="majorHAnsi" w:eastAsiaTheme="majorEastAsia" w:hAnsiTheme="majorHAnsi" w:cstheme="majorBidi"/>
       <w:color w:val="000000" w:themeColor="text1"/>
     </w:rPr>
     <w:tblPr>
@@ -14292,7 +14419,6 @@
       <w:spacing w:after="0" w:line="240" w:lineRule="auto"/>
     </w:pPr>
     <w:rPr>
-      <w:rFonts w:asciiTheme="majorHAnsi" w:eastAsiaTheme="majorEastAsia" w:hAnsiTheme="majorHAnsi" w:cstheme="majorBidi"/>
       <w:color w:val="000000" w:themeColor="text1"/>
     </w:rPr>
     <w:tblPr>
@@ -14410,7 +14536,6 @@
       <w:spacing w:after="0" w:line="240" w:lineRule="auto"/>
     </w:pPr>
     <w:rPr>
-      <w:rFonts w:asciiTheme="majorHAnsi" w:eastAsiaTheme="majorEastAsia" w:hAnsiTheme="majorHAnsi" w:cstheme="majorBidi"/>
       <w:color w:val="000000" w:themeColor="text1"/>
     </w:rPr>
     <w:tblPr>
@@ -18111,7 +18236,7 @@
     </a:clrScheme>
     <a:fontScheme name="Office">
       <a:majorFont>
-        <a:latin typeface="Calibri"/>
+        <a:latin typeface="David"/>
         <a:ea typeface=""/>
         <a:cs typeface=""/>
         <a:font script="Jpan" typeface="ＭＳ ゴシック"/>
@@ -18119,7 +18244,7 @@
         <a:font script="Hans" typeface="宋体"/>
         <a:font script="Hant" typeface="新細明體"/>
         <a:font script="Arab" typeface="Times New Roman"/>
-        <a:font script="Hebr" typeface="Times New Roman"/>
+        <a:font script="Hebr" typeface="David"/>
         <a:font script="Thai" typeface="Angsana New"/>
         <a:font script="Ethi" typeface="Nyala"/>
         <a:font script="Beng" typeface="Vrinda"/>
@@ -18146,7 +18271,7 @@
         <a:font script="Geor" typeface="Sylfaen"/>
       </a:majorFont>
       <a:minorFont>
-        <a:latin typeface="Cambria"/>
+        <a:latin typeface="David"/>
         <a:ea typeface=""/>
         <a:cs typeface=""/>
         <a:font script="Jpan" typeface="ＭＳ 明朝"/>
@@ -18154,7 +18279,7 @@
         <a:font script="Hans" typeface="宋体"/>
         <a:font script="Hant" typeface="新細明體"/>
         <a:font script="Arab" typeface="Arial"/>
-        <a:font script="Hebr" typeface="Arial"/>
+        <a:font script="Hebr" typeface="David"/>
         <a:font script="Thai" typeface="Cordia New"/>
         <a:font script="Ethi" typeface="Nyala"/>
         <a:font script="Beng" typeface="Vrinda"/>

</xml_diff>